<commit_message>
EV vs NV raw comparison: same bands, label style and values as Figure 1
Co-Authored-By: Claude Opus 5.5 <noreply@anthropic.com>
Claude-Session: https://claude.ai/code/session_01L8hQ8e5u5KmaH4dD9snyRw
</commit_message>
<xml_diff>
--- a/EV_NV_RawComparison_Code.docx
+++ b/EV_NV_RawComparison_Code.docx
@@ -307,7 +307,7 @@
           <w:sz w:val="15"/>
           <w:noProof/>
         </w:rPr>
-        <w:t># BAND LABELS COME FROM THE DATA: for each band window below, the most prominent</w:t>
+        <w:t># BAND LABELS: the same bands, classes, label style and peak-finding as Figure 1</w:t>
       </w:r>
     </w:p>
     <w:p>
@@ -320,7 +320,7 @@
           <w:sz w:val="15"/>
           <w:noProof/>
         </w:rPr>
-        <w:t>#   local maximum of the spectrum (located on a lightly smoothed copy,</w:t>
+        <w:t>#   (CaF2 vs Ag/SiNWs): most prominent local maximum within +/-12 cm-1 of each</w:t>
       </w:r>
     </w:p>
     <w:p>
@@ -333,7 +333,7 @@
           <w:sz w:val="15"/>
           <w:noProof/>
         </w:rPr>
-        <w:t>#   Savitzky-Golay 11 pts / order 3; the plotted line is raw) is labelled only if</w:t>
+        <w:t>#   nominal band, located on a lightly smoothed copy (Savitzky-Golay 11 pts /</w:t>
       </w:r>
     </w:p>
     <w:p>
@@ -346,7 +346,7 @@
           <w:sz w:val="15"/>
           <w:noProof/>
         </w:rPr>
-        <w:t>#   its prominence is at least MIN_SNR x the noise SD of that spectrum.</w:t>
+        <w:t>#   order 3; the plotted line is raw), so the numbers are identical to Figure 1.</w:t>
       </w:r>
     </w:p>
     <w:p>
@@ -359,7 +359,20 @@
           <w:sz w:val="15"/>
           <w:noProof/>
         </w:rPr>
-        <w:t>#   The table of all positions is printed and saved as EV_NV_RawComparison_peaks.csv.</w:t>
+        <w:t>#   The table (with prominence / noise) is printed and saved as</w:t>
+      </w:r>
+    </w:p>
+    <w:p>
+      <w:pPr>
+        <w:spacing w:before="0" w:after="0" w:line="240" w:lineRule="auto"/>
+      </w:pPr>
+      <w:r>
+        <w:rPr>
+          <w:rFonts w:ascii="Consolas" w:hAnsi="Consolas" w:eastAsia="Consolas" w:cs="Consolas"/>
+          <w:sz w:val="15"/>
+          <w:noProof/>
+        </w:rPr>
+        <w:t>#   EV_NV_RawComparison_peaks.csv.</w:t>
       </w:r>
     </w:p>
     <w:p>
@@ -667,19 +680,6 @@
           <w:sz w:val="15"/>
           <w:noProof/>
         </w:rPr>
-        <w:t>MIN_SNR = 3.0         # label a band only if prominence &gt;= 3 x noise SD</w:t>
-      </w:r>
-    </w:p>
-    <w:p>
-      <w:pPr>
-        <w:spacing w:before="0" w:after="0" w:line="240" w:lineRule="auto"/>
-      </w:pPr>
-      <w:r>
-        <w:rPr>
-          <w:rFonts w:ascii="Consolas" w:hAnsi="Consolas" w:eastAsia="Consolas" w:cs="Consolas"/>
-          <w:sz w:val="15"/>
-          <w:noProof/>
-        </w:rPr>
         <w:t>FS_LABEL, FS_NAME, FS_AXIS, FS_TICK = 13, 15, 17, 15</w:t>
       </w:r>
     </w:p>
@@ -705,7 +705,7 @@
           <w:sz w:val="15"/>
           <w:noProof/>
         </w:rPr>
-        <w:t>PURPLE, BLUE, DARKBLUE = '#7030A0', '#2E75B6', '#1F3864'</w:t>
+        <w:t># bands of Figure 1, per spectrum: (nominal cm-1, class, assignment)</w:t>
       </w:r>
     </w:p>
     <w:p>
@@ -718,7 +718,7 @@
           <w:sz w:val="15"/>
           <w:noProof/>
         </w:rPr>
-        <w:t>CLASS = {'Proteins': [('Proteins', PURPLE)], 'Lipids': [('Lipids', BLUE)],</w:t>
+        <w:t>PEAKS = {</w:t>
       </w:r>
     </w:p>
     <w:p>
@@ -731,7 +731,7 @@
           <w:sz w:val="15"/>
           <w:noProof/>
         </w:rPr>
-        <w:t xml:space="preserve">         'Nucleic Acids': [('Nucleic Acids', DARKBLUE)],</w:t>
+        <w:t xml:space="preserve">    'EV': [(519, 'Si substrate', 'Si optical phonon'), (831, 'Protein/NA', 'Tyr Fermi doublet / O-P-O'),</w:t>
       </w:r>
     </w:p>
     <w:p>
@@ -744,7 +744,7 @@
           <w:sz w:val="15"/>
           <w:noProof/>
         </w:rPr>
-        <w:t xml:space="preserve">         'Lipids/NA': [('Lipids/', BLUE), ('NA', 'k')],</w:t>
+        <w:t xml:space="preserve">           (1001, 'Protein', 'Phe ring breathing'), (1031, 'Protein', 'Phe C-H in-plane bending'),</w:t>
       </w:r>
     </w:p>
     <w:p>
@@ -757,7 +757,7 @@
           <w:sz w:val="15"/>
           <w:noProof/>
         </w:rPr>
-        <w:t xml:space="preserve">         'Proteins/Lipids': [('Proteins/', PURPLE), ('Lipids', BLUE)], None: []}</w:t>
+        <w:t xml:space="preserve">           (1166, 'Protein', 'Tyr C-H in-plane bending'), (1355, 'Protein', 'Trp / CH deformation'),</w:t>
       </w:r>
     </w:p>
     <w:p>
@@ -770,7 +770,7 @@
           <w:sz w:val="15"/>
           <w:noProof/>
         </w:rPr>
-        <w:t># band windows (lo, hi), class, assignment</w:t>
+        <w:t xml:space="preserve">           (1582, 'Protein', 'Phe C=C bending'), (1604, 'Protein', 'Phe/Tyr ring C=C stretching'),</w:t>
       </w:r>
     </w:p>
     <w:p>
@@ -783,7 +783,7 @@
           <w:sz w:val="15"/>
           <w:noProof/>
         </w:rPr>
-        <w:t>BANDS = [((507, 531), None, 'Si substrate (optical phonon)'),</w:t>
+        <w:t xml:space="preserve">           (1724, 'Lipid', 'C=O ester stretching'), (2929, 'Protein/Lipid', 'CH2/CH3 stretching')],</w:t>
       </w:r>
     </w:p>
     <w:p>
@@ -796,7 +796,7 @@
           <w:sz w:val="15"/>
           <w:noProof/>
         </w:rPr>
-        <w:t xml:space="preserve">         ((790, 812), 'Nucleic Acids', 'O-P-O backbone stretching'),</w:t>
+        <w:t xml:space="preserve">    'NV': [(519, 'Si substrate', 'Si optical phonon'), (612, 'Protein', 'Phe C-C twisting'),</w:t>
       </w:r>
     </w:p>
     <w:p>
@@ -809,7 +809,7 @@
           <w:sz w:val="15"/>
           <w:noProof/>
         </w:rPr>
-        <w:t xml:space="preserve">         ((818, 842), 'Proteins', 'Tyr Fermi doublet'),</w:t>
+        <w:t xml:space="preserve">           (797, 'Nucleic acid', 'O-P-O backbone stretching'),</w:t>
       </w:r>
     </w:p>
     <w:p>
@@ -822,7 +822,7 @@
           <w:sz w:val="15"/>
           <w:noProof/>
         </w:rPr>
-        <w:t xml:space="preserve">         ((848, 862), 'Proteins', 'Tyr Fermi doublet'),</w:t>
+        <w:t xml:space="preserve">           (826, 'Protein/NA', 'Tyr Fermi doublet / O-P-O'), (921, 'Protein/Carb.', 'C-C proline / glucose'),</w:t>
       </w:r>
     </w:p>
     <w:p>
@@ -835,7 +835,7 @@
           <w:sz w:val="15"/>
           <w:noProof/>
         </w:rPr>
-        <w:t xml:space="preserve">         ((912, 930), 'Proteins', 'C-C stretching (Pro) / glucose'),</w:t>
+        <w:t xml:space="preserve">           (1001, 'Protein', 'Phe ring breathing'), (1031, 'Protein', 'Phe C-H in-plane bending'),</w:t>
       </w:r>
     </w:p>
     <w:p>
@@ -848,7 +848,7 @@
           <w:sz w:val="15"/>
           <w:noProof/>
         </w:rPr>
-        <w:t xml:space="preserve">         ((993, 1010), 'Proteins', 'Phe ring breathing'),</w:t>
+        <w:t xml:space="preserve">           (1240, 'Protein', 'Amide III'), (1386, 'Lipid/Protein', 'CH3 deformation / COO-'),</w:t>
       </w:r>
     </w:p>
     <w:p>
@@ -861,7 +861,7 @@
           <w:sz w:val="15"/>
           <w:noProof/>
         </w:rPr>
-        <w:t xml:space="preserve">         ((1024, 1042), 'Proteins', 'Phe C-H in-plane bending'),</w:t>
+        <w:t xml:space="preserve">           (1607, 'Protein', 'Phe/Tyr ring C=C stretching'), (1624, 'Protein', 'Trp/Tyr C=C, amide I side'),</w:t>
       </w:r>
     </w:p>
     <w:p>
@@ -874,7 +874,7 @@
           <w:sz w:val="15"/>
           <w:noProof/>
         </w:rPr>
-        <w:t xml:space="preserve">         ((1155, 1178), 'Proteins', 'Tyr C-H bending'),</w:t>
+        <w:t xml:space="preserve">           (2936, 'Protein/Lipid', 'CH3 symmetric stretching')]}</w:t>
       </w:r>
     </w:p>
     <w:p>
@@ -887,7 +887,7 @@
           <w:sz w:val="15"/>
           <w:noProof/>
         </w:rPr>
-        <w:t xml:space="preserve">         ((1230, 1255), 'Proteins', 'Amide III'),</w:t>
+        <w:t># label colour by class (as in Figure 1)</w:t>
       </w:r>
     </w:p>
     <w:p>
@@ -900,7 +900,7 @@
           <w:sz w:val="15"/>
           <w:noProof/>
         </w:rPr>
-        <w:t xml:space="preserve">         ((1340, 1365), 'Proteins', 'Trp / CH deformation'),</w:t>
+        <w:t>CLASS_COL = {'Protein': '#1F6FB4', 'Protein/NA': '#6A3D9A', 'Nucleic acid': '#8E44AD',</w:t>
       </w:r>
     </w:p>
     <w:p>
@@ -913,7 +913,7 @@
           <w:sz w:val="15"/>
           <w:noProof/>
         </w:rPr>
-        <w:t xml:space="preserve">         ((1370, 1395), 'Lipids/NA', 'CH3 deformation / nucleic-acid bases'),</w:t>
+        <w:t xml:space="preserve">             'Protein/Carb.': '#1F6FB4', 'Lipid/Protein': '#D35400', 'Protein/Lipid': '#D35400',</w:t>
       </w:r>
     </w:p>
     <w:p>
@@ -926,59 +926,7 @@
           <w:sz w:val="15"/>
           <w:noProof/>
         </w:rPr>
-        <w:t xml:space="preserve">         ((1574, 1590), 'Proteins', 'Phe C=C bending'),</w:t>
-      </w:r>
-    </w:p>
-    <w:p>
-      <w:pPr>
-        <w:spacing w:before="0" w:after="0" w:line="240" w:lineRule="auto"/>
-      </w:pPr>
-      <w:r>
-        <w:rPr>
-          <w:rFonts w:ascii="Consolas" w:hAnsi="Consolas" w:eastAsia="Consolas" w:cs="Consolas"/>
-          <w:sz w:val="15"/>
-          <w:noProof/>
-        </w:rPr>
-        <w:t xml:space="preserve">         ((1596, 1612), 'Proteins', 'Phe/Tyr ring C=C stretching'),</w:t>
-      </w:r>
-    </w:p>
-    <w:p>
-      <w:pPr>
-        <w:spacing w:before="0" w:after="0" w:line="240" w:lineRule="auto"/>
-      </w:pPr>
-      <w:r>
-        <w:rPr>
-          <w:rFonts w:ascii="Consolas" w:hAnsi="Consolas" w:eastAsia="Consolas" w:cs="Consolas"/>
-          <w:sz w:val="15"/>
-          <w:noProof/>
-        </w:rPr>
-        <w:t xml:space="preserve">         ((1616, 1632), 'Proteins', 'Tyr/Trp ring C=C stretching'),</w:t>
-      </w:r>
-    </w:p>
-    <w:p>
-      <w:pPr>
-        <w:spacing w:before="0" w:after="0" w:line="240" w:lineRule="auto"/>
-      </w:pPr>
-      <w:r>
-        <w:rPr>
-          <w:rFonts w:ascii="Consolas" w:hAnsi="Consolas" w:eastAsia="Consolas" w:cs="Consolas"/>
-          <w:sz w:val="15"/>
-          <w:noProof/>
-        </w:rPr>
-        <w:t xml:space="preserve">         ((1715, 1740), 'Lipids', 'C=O ester stretching'),</w:t>
-      </w:r>
-    </w:p>
-    <w:p>
-      <w:pPr>
-        <w:spacing w:before="0" w:after="0" w:line="240" w:lineRule="auto"/>
-      </w:pPr>
-      <w:r>
-        <w:rPr>
-          <w:rFonts w:ascii="Consolas" w:hAnsi="Consolas" w:eastAsia="Consolas" w:cs="Consolas"/>
-          <w:sz w:val="15"/>
-          <w:noProof/>
-        </w:rPr>
-        <w:t xml:space="preserve">         ((2920, 2945), 'Proteins/Lipids', 'CH3 / CH2 stretching')]</w:t>
+        <w:t xml:space="preserve">             'Lipid': '#C0392B', 'Si substrate': '#7F7F7F'}</w:t>
       </w:r>
     </w:p>
     <w:p>
@@ -1520,7 +1468,7 @@
           <w:sz w:val="15"/>
           <w:noProof/>
         </w:rPr>
-        <w:t xml:space="preserve">    for (lo, hi), cls, assign in BANDS:</w:t>
+        <w:t xml:space="preserve">    for nominal, cls, assign in PEAKS[kind]:</w:t>
       </w:r>
     </w:p>
     <w:p>
@@ -1533,33 +1481,7 @@
           <w:sz w:val="15"/>
           <w:noProof/>
         </w:rPr>
-        <w:t xml:space="preserve">        k = np.flatnonzero((x &gt;= lo) &amp; (x &lt;= hi))</w:t>
-      </w:r>
-    </w:p>
-    <w:p>
-      <w:pPr>
-        <w:spacing w:before="0" w:after="0" w:line="240" w:lineRule="auto"/>
-      </w:pPr>
-      <w:r>
-        <w:rPr>
-          <w:rFonts w:ascii="Consolas" w:hAnsi="Consolas" w:eastAsia="Consolas" w:cs="Consolas"/>
-          <w:sz w:val="15"/>
-          <w:noProof/>
-        </w:rPr>
-        <w:t xml:space="preserve">        if len(k) &lt; 3:</w:t>
-      </w:r>
-    </w:p>
-    <w:p>
-      <w:pPr>
-        <w:spacing w:before="0" w:after="0" w:line="240" w:lineRule="auto"/>
-      </w:pPr>
-      <w:r>
-        <w:rPr>
-          <w:rFonts w:ascii="Consolas" w:hAnsi="Consolas" w:eastAsia="Consolas" w:cs="Consolas"/>
-          <w:sz w:val="15"/>
-          <w:noProof/>
-        </w:rPr>
-        <w:t xml:space="preserve">            continue</w:t>
+        <w:t xml:space="preserve">        k = np.flatnonzero(np.abs(x - nominal) &lt;= 12)</w:t>
       </w:r>
     </w:p>
     <w:p>
@@ -1585,7 +1507,7 @@
           <w:sz w:val="15"/>
           <w:noProof/>
         </w:rPr>
-        <w:t xml:space="preserve">        if not len(pk):</w:t>
+        <w:t xml:space="preserve">        j = int(np.argmax(pr['prominences']))</w:t>
       </w:r>
     </w:p>
     <w:p>
@@ -1598,7 +1520,7 @@
           <w:sz w:val="15"/>
           <w:noProof/>
         </w:rPr>
-        <w:t xml:space="preserve">            rows.append([kind, f'{lo}-{hi}', '', '', cls, assign, 'no local maximum'])</w:t>
+        <w:t xml:space="preserve">        pos = int(round(float(x[k[pk[j]]])))</w:t>
       </w:r>
     </w:p>
     <w:p>
@@ -1611,7 +1533,7 @@
           <w:sz w:val="15"/>
           <w:noProof/>
         </w:rPr>
-        <w:t xml:space="preserve">            continue</w:t>
+        <w:t xml:space="preserve">        snr = pr['prominences'][j] / noise</w:t>
       </w:r>
     </w:p>
     <w:p>
@@ -1624,7 +1546,7 @@
           <w:sz w:val="15"/>
           <w:noProof/>
         </w:rPr>
-        <w:t xml:space="preserve">        j = int(np.argmax(pr['prominences']))</w:t>
+        <w:t xml:space="preserve">        rows.append([kind, nominal, pos, round(float(snr), 1), cls, assign])</w:t>
       </w:r>
     </w:p>
     <w:p>
@@ -1637,7 +1559,7 @@
           <w:sz w:val="15"/>
           <w:noProof/>
         </w:rPr>
-        <w:t xml:space="preserve">        pos, snr = x[k[pk[j]]], pr['prominences'][j] / noise</w:t>
+        <w:t xml:space="preserve">        labels[kind].append((pos, cls))</w:t>
       </w:r>
     </w:p>
     <w:p>
@@ -1650,7 +1572,7 @@
           <w:sz w:val="15"/>
           <w:noProof/>
         </w:rPr>
-        <w:t xml:space="preserve">        ok = snr &gt;= MIN_SNR</w:t>
+        <w:t>print('\nBAND POSITIONS (raw spectra, same method as Figure 1)')</w:t>
       </w:r>
     </w:p>
     <w:p>
@@ -1663,72 +1585,7 @@
           <w:sz w:val="15"/>
           <w:noProof/>
         </w:rPr>
-        <w:t xml:space="preserve">        rows.append([kind, f'{lo}-{hi}', round(float(pos), 1), round(float(snr), 1), cls, assign,</w:t>
-      </w:r>
-    </w:p>
-    <w:p>
-      <w:pPr>
-        <w:spacing w:before="0" w:after="0" w:line="240" w:lineRule="auto"/>
-      </w:pPr>
-      <w:r>
-        <w:rPr>
-          <w:rFonts w:ascii="Consolas" w:hAnsi="Consolas" w:eastAsia="Consolas" w:cs="Consolas"/>
-          <w:sz w:val="15"/>
-          <w:noProof/>
-        </w:rPr>
-        <w:t xml:space="preserve">                     'labelled' if ok else f'not labelled (&lt; {MIN_SNR:g} x noise)'])</w:t>
-      </w:r>
-    </w:p>
-    <w:p>
-      <w:pPr>
-        <w:spacing w:before="0" w:after="0" w:line="240" w:lineRule="auto"/>
-      </w:pPr>
-      <w:r>
-        <w:rPr>
-          <w:rFonts w:ascii="Consolas" w:hAnsi="Consolas" w:eastAsia="Consolas" w:cs="Consolas"/>
-          <w:sz w:val="15"/>
-          <w:noProof/>
-        </w:rPr>
-        <w:t xml:space="preserve">        if ok:</w:t>
-      </w:r>
-    </w:p>
-    <w:p>
-      <w:pPr>
-        <w:spacing w:before="0" w:after="0" w:line="240" w:lineRule="auto"/>
-      </w:pPr>
-      <w:r>
-        <w:rPr>
-          <w:rFonts w:ascii="Consolas" w:hAnsi="Consolas" w:eastAsia="Consolas" w:cs="Consolas"/>
-          <w:sz w:val="15"/>
-          <w:noProof/>
-        </w:rPr>
-        <w:t xml:space="preserve">            labels[kind].append((pos, cls))</w:t>
-      </w:r>
-    </w:p>
-    <w:p>
-      <w:pPr>
-        <w:spacing w:before="0" w:after="0" w:line="240" w:lineRule="auto"/>
-      </w:pPr>
-      <w:r>
-        <w:rPr>
-          <w:rFonts w:ascii="Consolas" w:hAnsi="Consolas" w:eastAsia="Consolas" w:cs="Consolas"/>
-          <w:sz w:val="15"/>
-          <w:noProof/>
-        </w:rPr>
-        <w:t>print('\nBAND POSITIONS (raw spectra)')</w:t>
-      </w:r>
-    </w:p>
-    <w:p>
-      <w:pPr>
-        <w:spacing w:before="0" w:after="0" w:line="240" w:lineRule="auto"/>
-      </w:pPr>
-      <w:r>
-        <w:rPr>
-          <w:rFonts w:ascii="Consolas" w:hAnsi="Consolas" w:eastAsia="Consolas" w:cs="Consolas"/>
-          <w:sz w:val="15"/>
-          <w:noProof/>
-        </w:rPr>
-        <w:t>print(f'{"Spectrum":8s} {"Window":10s} {"Position":&gt;9s} {"Prom/noise":&gt;10s}  {"Class":16s} Result')</w:t>
+        <w:t>print(f'{"Spectrum":8s} {"Nominal":&gt;7s} {"Measured":&gt;8s} {"Prom/noise":&gt;10s}  Class')</w:t>
       </w:r>
     </w:p>
     <w:p>
@@ -1754,7 +1611,7 @@
           <w:sz w:val="15"/>
           <w:noProof/>
         </w:rPr>
-        <w:t xml:space="preserve">    print(f'{r[0]:8s} {r[1]:10s} {str(r[2]):&gt;9s} {str(r[3]):&gt;10s}  {str(r[4]):16s} {r[6]}')</w:t>
+        <w:t xml:space="preserve">    print(f'{r[0]:8s} {r[1]:7d} {r[2]:8d} {r[3]:10.1f}  {r[4]}')</w:t>
       </w:r>
     </w:p>
     <w:p>
@@ -1793,7 +1650,7 @@
           <w:sz w:val="15"/>
           <w:noProof/>
         </w:rPr>
-        <w:t xml:space="preserve">    w.writerow(['Spectrum', 'Window (cm-1)', 'Position (cm-1)', 'Prominence / noise SD', 'Class',</w:t>
+        <w:t xml:space="preserve">    w.writerow(['Spectrum', 'Nominal (cm-1)', 'Measured (cm-1)', 'Prominence / noise SD', 'Class',</w:t>
       </w:r>
     </w:p>
     <w:p>
@@ -1806,7 +1663,7 @@
           <w:sz w:val="15"/>
           <w:noProof/>
         </w:rPr>
-        <w:t xml:space="preserve">                'Assignment', 'Result'])</w:t>
+        <w:t xml:space="preserve">                'Assignment'])</w:t>
       </w:r>
     </w:p>
     <w:p>
@@ -2034,7 +1891,7 @@
           <w:sz w:val="15"/>
           <w:noProof/>
         </w:rPr>
-        <w:t xml:space="preserve">    """Vertical label: black number + coloured class, stacked upwards; returns top."""</w:t>
+        <w:t xml:space="preserve">    """Vertical label 'position  class' in the class colour (as in Figure 1); returns top."""</w:t>
       </w:r>
     </w:p>
     <w:p>
@@ -2047,7 +1904,7 @@
           <w:sz w:val="15"/>
           <w:noProof/>
         </w:rPr>
-        <w:t xml:space="preserve">    yy = y0</w:t>
+        <w:t xml:space="preserve">    h = ax.text(x, y0, f'{text}  {cls}', rotation=90, ha='center', va='bottom', fontsize=FS_LABEL,</w:t>
       </w:r>
     </w:p>
     <w:p>
@@ -2060,7 +1917,7 @@
           <w:sz w:val="15"/>
           <w:noProof/>
         </w:rPr>
-        <w:t xml:space="preserve">    yr = np.diff(ax.get_ylim())[0]</w:t>
+        <w:t xml:space="preserve">                color=CLASS_COL[cls])</w:t>
       </w:r>
     </w:p>
     <w:p>
@@ -2073,7 +1930,7 @@
           <w:sz w:val="15"/>
           <w:noProof/>
         </w:rPr>
-        <w:t xml:space="preserve">    top = y0</w:t>
+        <w:t xml:space="preserve">    fig.canvas.draw()</w:t>
       </w:r>
     </w:p>
     <w:p>
@@ -2086,72 +1943,7 @@
           <w:sz w:val="15"/>
           <w:noProof/>
         </w:rPr>
-        <w:t xml:space="preserve">    for t, col in [(text + ('- ' if cls else ''), 'k')] + CLASS[cls]:</w:t>
-      </w:r>
-    </w:p>
-    <w:p>
-      <w:pPr>
-        <w:spacing w:before="0" w:after="0" w:line="240" w:lineRule="auto"/>
-      </w:pPr>
-      <w:r>
-        <w:rPr>
-          <w:rFonts w:ascii="Consolas" w:hAnsi="Consolas" w:eastAsia="Consolas" w:cs="Consolas"/>
-          <w:sz w:val="15"/>
-          <w:noProof/>
-        </w:rPr>
-        <w:t xml:space="preserve">        h = ax.text(x, yy, t, rotation=90, ha='center', va='bottom', fontsize=FS_LABEL, color=col)</w:t>
-      </w:r>
-    </w:p>
-    <w:p>
-      <w:pPr>
-        <w:spacing w:before="0" w:after="0" w:line="240" w:lineRule="auto"/>
-      </w:pPr>
-      <w:r>
-        <w:rPr>
-          <w:rFonts w:ascii="Consolas" w:hAnsi="Consolas" w:eastAsia="Consolas" w:cs="Consolas"/>
-          <w:sz w:val="15"/>
-          <w:noProof/>
-        </w:rPr>
-        <w:t xml:space="preserve">        fig.canvas.draw()</w:t>
-      </w:r>
-    </w:p>
-    <w:p>
-      <w:pPr>
-        <w:spacing w:before="0" w:after="0" w:line="240" w:lineRule="auto"/>
-      </w:pPr>
-      <w:r>
-        <w:rPr>
-          <w:rFonts w:ascii="Consolas" w:hAnsi="Consolas" w:eastAsia="Consolas" w:cs="Consolas"/>
-          <w:sz w:val="15"/>
-          <w:noProof/>
-        </w:rPr>
-        <w:t xml:space="preserve">        top = h.get_window_extent().transformed(ax.transData.inverted()).y1</w:t>
-      </w:r>
-    </w:p>
-    <w:p>
-      <w:pPr>
-        <w:spacing w:before="0" w:after="0" w:line="240" w:lineRule="auto"/>
-      </w:pPr>
-      <w:r>
-        <w:rPr>
-          <w:rFonts w:ascii="Consolas" w:hAnsi="Consolas" w:eastAsia="Consolas" w:cs="Consolas"/>
-          <w:sz w:val="15"/>
-          <w:noProof/>
-        </w:rPr>
-        <w:t xml:space="preserve">        yy = top - 0.004 * yr</w:t>
-      </w:r>
-    </w:p>
-    <w:p>
-      <w:pPr>
-        <w:spacing w:before="0" w:after="0" w:line="240" w:lineRule="auto"/>
-      </w:pPr>
-      <w:r>
-        <w:rPr>
-          <w:rFonts w:ascii="Consolas" w:hAnsi="Consolas" w:eastAsia="Consolas" w:cs="Consolas"/>
-          <w:sz w:val="15"/>
-          <w:noProof/>
-        </w:rPr>
-        <w:t xml:space="preserve">    return top</w:t>
+        <w:t xml:space="preserve">    return h.get_window_extent().transformed(ax.transData.inverted()).y1</w:t>
       </w:r>
     </w:p>
     <w:p>
@@ -2994,7 +2786,7 @@
           <w:sz w:val="15"/>
           <w:noProof/>
         </w:rPr>
-        <w:t xml:space="preserve">                text = f'{p:.1f}' if cls is None else f'{p:.0f}'</w:t>
+        <w:t xml:space="preserve">                text = f'{p}'</w:t>
       </w:r>
     </w:p>
     <w:p>

</xml_diff>